<commit_message>
fixed dark and index
</commit_message>
<xml_diff>
--- a/docs/activities/01_01_activity/intro_class_activity.docx
+++ b/docs/activities/01_01_activity/intro_class_activity.docx
@@ -34,13 +34,13 @@
         <w:t xml:space="preserve">2026-07-02</w:t>
       </w:r>
     </w:p>
-    <w:bookmarkStart w:id="9" w:name="in-class-activity-1"/>
+    <w:bookmarkStart w:id="9" w:name="Xc523976e3a6bb2dfa6866709cbd5dd932317ee3"/>
     <w:p>
       <w:pPr>
         <w:pStyle w:val="Heading1"/>
       </w:pPr>
       <w:r>
-        <w:t xml:space="preserve">In class activity 1:</w:t>
+        <w:t xml:space="preserve">Introduction and gathering and organizing data</w:t>
       </w:r>
     </w:p>
     <w:bookmarkEnd w:id="9"/>

</xml_diff>